<commit_message>
Add Quality Management to PM toolkit and dashboard
Fills the PMBOK quality-management gap identified on review: each
project's Charter now includes a Quality Management Plan (standards,
QA activities, QC/inspection & test checkpoints), each PM Tracking
Workbook has a Quality_Checklist tab, and the dashboard has a new
Quality Management page mirroring both. Applied to the blank
templates and both worked example projects.

Co-Authored-By: Claude Sonnet 5 <noreply@anthropic.com>
</commit_message>
<xml_diff>
--- a/dtw-it-center-pm-toolkit/01-construction-infrastructure-project/01_Charter_Comms_Commissioning_Plan.docx
+++ b/dtw-it-center-pm-toolkit/01-construction-infrastructure-project/01_Charter_Comms_Commissioning_Plan.docx
@@ -2828,7 +2828,1204 @@
           <w:sz w:val="27"/>
           <w:szCs w:val="27"/>
         </w:rPr>
-        <w:t xml:space="preserve">3. Commissioning &amp; Facility Handover Plan</w:t>
+        <w:t xml:space="preserve">3. Quality Management Plan</w:t>
+      </w:r>
+    </w:p>
+    <w:p>
+      <w:pPr>
+        <w:spacing w:after="160"/>
+      </w:pPr>
+      <w:r>
+        <w:rPr>
+          <w:sz w:val="21"/>
+          <w:szCs w:val="21"/>
+        </w:rPr>
+        <w:t xml:space="preserve">Quality on this project is governed by the applicable building, electrical, mechanical, and fire codes; the MEP Engineer of Record's design specifications; and a Tier III-aligned commissioning standard (Uptime Institute / ASHRAE TC 9.9 practice). Quality is assured throughout construction — not just verified at the end — through scheduled design reviews, code-compliance walkthroughs, and subcontractor performance audits, and controlled through inspection and test checkpoints at each phase gate.</w:t>
+      </w:r>
+    </w:p>
+    <w:p>
+      <w:pPr>
+        <w:pStyle w:val="Heading2"/>
+        <w:spacing w:after="100" w:before="220"/>
+      </w:pPr>
+      <w:r>
+        <w:rPr>
+          <w:b/>
+          <w:bCs/>
+          <w:color w:val="44546A"/>
+          <w:sz w:val="23"/>
+          <w:szCs w:val="23"/>
+        </w:rPr>
+        <w:t xml:space="preserve">3.1  Quality Objectives</w:t>
+      </w:r>
+    </w:p>
+    <w:p>
+      <w:pPr>
+        <w:pStyle w:val="ListParagraph"/>
+        <w:numPr>
+          <w:ilvl w:val="0"/>
+          <w:numId w:val="1"/>
+        </w:numPr>
+        <w:spacing w:after="60"/>
+      </w:pPr>
+      <w:r>
+        <w:rPr>
+          <w:sz w:val="21"/>
+          <w:szCs w:val="21"/>
+        </w:rPr>
+        <w:t xml:space="preserve">Zero AHJ inspection failures on first submission (re-inspections tracked as a leading quality indicator, not just a schedule risk).</w:t>
+      </w:r>
+    </w:p>
+    <w:p>
+      <w:pPr>
+        <w:pStyle w:val="ListParagraph"/>
+        <w:numPr>
+          <w:ilvl w:val="0"/>
+          <w:numId w:val="1"/>
+        </w:numPr>
+        <w:spacing w:after="60"/>
+      </w:pPr>
+      <w:r>
+        <w:rPr>
+          <w:sz w:val="21"/>
+          <w:szCs w:val="21"/>
+        </w:rPr>
+        <w:t xml:space="preserve">100% of Level 1–4 commissioning checklist items passed before Substantial Completion.</w:t>
+      </w:r>
+    </w:p>
+    <w:p>
+      <w:pPr>
+        <w:pStyle w:val="ListParagraph"/>
+        <w:numPr>
+          <w:ilvl w:val="0"/>
+          <w:numId w:val="1"/>
+        </w:numPr>
+        <w:spacing w:after="60"/>
+      </w:pPr>
+      <w:r>
+        <w:rPr>
+          <w:sz w:val="21"/>
+          <w:szCs w:val="21"/>
+        </w:rPr>
+        <w:t xml:space="preserve">Punch-list items closed within 30 days of Substantial Completion, with no life-safety-related items outstanding.</w:t>
+      </w:r>
+    </w:p>
+    <w:p>
+      <w:pPr>
+        <w:pStyle w:val="Heading2"/>
+        <w:spacing w:after="100" w:before="220"/>
+      </w:pPr>
+      <w:r>
+        <w:rPr>
+          <w:b/>
+          <w:bCs/>
+          <w:color w:val="44546A"/>
+          <w:sz w:val="23"/>
+          <w:szCs w:val="23"/>
+        </w:rPr>
+        <w:t xml:space="preserve">3.2  Quality Assurance Activities</w:t>
+      </w:r>
+    </w:p>
+    <w:p>
+      <w:pPr>
+        <w:spacing w:after="160"/>
+      </w:pPr>
+      <w:r>
+        <w:rPr>
+          <w:sz w:val="21"/>
+          <w:szCs w:val="21"/>
+        </w:rPr>
+        <w:t xml:space="preserve">Proactive reviews and audits performed during design and construction to prevent defects before they reach an inspection or commissioning checkpoint.</w:t>
+      </w:r>
+    </w:p>
+    <w:tbl>
+      <w:tblPr>
+        <w:tblW w:type="dxa" w:w="10800"/>
+        <w:tblBorders>
+          <w:top w:val="single" w:color="auto" w:sz="4"/>
+          <w:left w:val="single" w:color="auto" w:sz="4"/>
+          <w:bottom w:val="single" w:color="auto" w:sz="4"/>
+          <w:right w:val="single" w:color="auto" w:sz="4"/>
+          <w:insideH w:val="single" w:color="auto" w:sz="4"/>
+          <w:insideV w:val="single" w:color="auto" w:sz="4"/>
+        </w:tblBorders>
+      </w:tblPr>
+      <w:tblGrid>
+        <w:gridCol w:w="3200"/>
+        <w:gridCol w:w="3400"/>
+        <w:gridCol w:w="2000"/>
+        <w:gridCol w:w="2200"/>
+      </w:tblGrid>
+      <w:tr>
+        <w:trPr>
+          <w:tblHeader/>
+        </w:trPr>
+        <w:tc>
+          <w:tcPr>
+            <w:tcW w:type="dxa" w:w="3200"/>
+            <w:shd w:fill="1F3864" w:val="clear"/>
+            <w:tcMar>
+              <w:top w:type="dxa" w:w="80"/>
+              <w:left w:type="dxa" w:w="100"/>
+              <w:bottom w:type="dxa" w:w="80"/>
+              <w:right w:type="dxa" w:w="100"/>
+            </w:tcMar>
+            <w:vAlign w:val="center"/>
+          </w:tcPr>
+          <w:p>
+            <w:r>
+              <w:rPr>
+                <w:b/>
+                <w:bCs/>
+                <w:color w:val="FFFFFF"/>
+                <w:sz w:val="19"/>
+                <w:szCs w:val="19"/>
+              </w:rPr>
+              <w:t xml:space="preserve">Activity</w:t>
+            </w:r>
+          </w:p>
+        </w:tc>
+        <w:tc>
+          <w:tcPr>
+            <w:tcW w:type="dxa" w:w="3400"/>
+            <w:shd w:fill="1F3864" w:val="clear"/>
+            <w:tcMar>
+              <w:top w:type="dxa" w:w="80"/>
+              <w:left w:type="dxa" w:w="100"/>
+              <w:bottom w:type="dxa" w:w="80"/>
+              <w:right w:type="dxa" w:w="100"/>
+            </w:tcMar>
+            <w:vAlign w:val="center"/>
+          </w:tcPr>
+          <w:p>
+            <w:r>
+              <w:rPr>
+                <w:b/>
+                <w:bCs/>
+                <w:color w:val="FFFFFF"/>
+                <w:sz w:val="19"/>
+                <w:szCs w:val="19"/>
+              </w:rPr>
+              <w:t xml:space="preserve">Method</w:t>
+            </w:r>
+          </w:p>
+        </w:tc>
+        <w:tc>
+          <w:tcPr>
+            <w:tcW w:type="dxa" w:w="2000"/>
+            <w:shd w:fill="1F3864" w:val="clear"/>
+            <w:tcMar>
+              <w:top w:type="dxa" w:w="80"/>
+              <w:left w:type="dxa" w:w="100"/>
+              <w:bottom w:type="dxa" w:w="80"/>
+              <w:right w:type="dxa" w:w="100"/>
+            </w:tcMar>
+            <w:vAlign w:val="center"/>
+          </w:tcPr>
+          <w:p>
+            <w:r>
+              <w:rPr>
+                <w:b/>
+                <w:bCs/>
+                <w:color w:val="FFFFFF"/>
+                <w:sz w:val="19"/>
+                <w:szCs w:val="19"/>
+              </w:rPr>
+              <w:t xml:space="preserve">Frequency</w:t>
+            </w:r>
+          </w:p>
+        </w:tc>
+        <w:tc>
+          <w:tcPr>
+            <w:tcW w:type="dxa" w:w="2200"/>
+            <w:shd w:fill="1F3864" w:val="clear"/>
+            <w:tcMar>
+              <w:top w:type="dxa" w:w="80"/>
+              <w:left w:type="dxa" w:w="100"/>
+              <w:bottom w:type="dxa" w:w="80"/>
+              <w:right w:type="dxa" w:w="100"/>
+            </w:tcMar>
+            <w:vAlign w:val="center"/>
+          </w:tcPr>
+          <w:p>
+            <w:r>
+              <w:rPr>
+                <w:b/>
+                <w:bCs/>
+                <w:color w:val="FFFFFF"/>
+                <w:sz w:val="19"/>
+                <w:szCs w:val="19"/>
+              </w:rPr>
+              <w:t xml:space="preserve">Owner</w:t>
+            </w:r>
+          </w:p>
+        </w:tc>
+      </w:tr>
+      <w:tr>
+        <w:tc>
+          <w:tcPr>
+            <w:tcW w:type="dxa" w:w="3200"/>
+            <w:tcMar>
+              <w:top w:type="dxa" w:w="80"/>
+              <w:left w:type="dxa" w:w="100"/>
+              <w:bottom w:type="dxa" w:w="80"/>
+              <w:right w:type="dxa" w:w="100"/>
+            </w:tcMar>
+            <w:vAlign w:val="center"/>
+          </w:tcPr>
+          <w:p>
+            <w:r>
+              <w:rPr>
+                <w:sz w:val="19"/>
+                <w:szCs w:val="19"/>
+              </w:rPr>
+              <w:t xml:space="preserve">Design development review (MEP, structural, life-safety)</w:t>
+            </w:r>
+          </w:p>
+        </w:tc>
+        <w:tc>
+          <w:tcPr>
+            <w:tcW w:type="dxa" w:w="3400"/>
+            <w:tcMar>
+              <w:top w:type="dxa" w:w="80"/>
+              <w:left w:type="dxa" w:w="100"/>
+              <w:bottom w:type="dxa" w:w="80"/>
+              <w:right w:type="dxa" w:w="100"/>
+            </w:tcMar>
+            <w:vAlign w:val="center"/>
+          </w:tcPr>
+          <w:p>
+            <w:r>
+              <w:rPr>
+                <w:sz w:val="19"/>
+                <w:szCs w:val="19"/>
+              </w:rPr>
+              <w:t xml:space="preserve">Formal design review with Engineer of Record</w:t>
+            </w:r>
+          </w:p>
+        </w:tc>
+        <w:tc>
+          <w:tcPr>
+            <w:tcW w:type="dxa" w:w="2000"/>
+            <w:tcMar>
+              <w:top w:type="dxa" w:w="80"/>
+              <w:left w:type="dxa" w:w="100"/>
+              <w:bottom w:type="dxa" w:w="80"/>
+              <w:right w:type="dxa" w:w="100"/>
+            </w:tcMar>
+            <w:vAlign w:val="center"/>
+          </w:tcPr>
+          <w:p>
+            <w:r>
+              <w:rPr>
+                <w:sz w:val="19"/>
+                <w:szCs w:val="19"/>
+              </w:rPr>
+              <w:t xml:space="preserve">At each design milestone</w:t>
+            </w:r>
+          </w:p>
+        </w:tc>
+        <w:tc>
+          <w:tcPr>
+            <w:tcW w:type="dxa" w:w="2200"/>
+            <w:tcMar>
+              <w:top w:type="dxa" w:w="80"/>
+              <w:left w:type="dxa" w:w="100"/>
+              <w:bottom w:type="dxa" w:w="80"/>
+              <w:right w:type="dxa" w:w="100"/>
+            </w:tcMar>
+            <w:vAlign w:val="center"/>
+          </w:tcPr>
+          <w:p>
+            <w:r>
+              <w:rPr>
+                <w:sz w:val="19"/>
+                <w:szCs w:val="19"/>
+              </w:rPr>
+              <w:t xml:space="preserve">PM / MEP Engineer</w:t>
+            </w:r>
+          </w:p>
+        </w:tc>
+      </w:tr>
+      <w:tr>
+        <w:tc>
+          <w:tcPr>
+            <w:tcW w:type="dxa" w:w="3200"/>
+            <w:shd w:fill="D9E2F3" w:val="clear"/>
+            <w:tcMar>
+              <w:top w:type="dxa" w:w="80"/>
+              <w:left w:type="dxa" w:w="100"/>
+              <w:bottom w:type="dxa" w:w="80"/>
+              <w:right w:type="dxa" w:w="100"/>
+            </w:tcMar>
+            <w:vAlign w:val="center"/>
+          </w:tcPr>
+          <w:p>
+            <w:r>
+              <w:rPr>
+                <w:sz w:val="19"/>
+                <w:szCs w:val="19"/>
+              </w:rPr>
+              <w:t xml:space="preserve">Code-compliance walkthrough with AHJ</w:t>
+            </w:r>
+          </w:p>
+        </w:tc>
+        <w:tc>
+          <w:tcPr>
+            <w:tcW w:type="dxa" w:w="3400"/>
+            <w:shd w:fill="D9E2F3" w:val="clear"/>
+            <w:tcMar>
+              <w:top w:type="dxa" w:w="80"/>
+              <w:left w:type="dxa" w:w="100"/>
+              <w:bottom w:type="dxa" w:w="80"/>
+              <w:right w:type="dxa" w:w="100"/>
+            </w:tcMar>
+            <w:vAlign w:val="center"/>
+          </w:tcPr>
+          <w:p>
+            <w:r>
+              <w:rPr>
+                <w:sz w:val="19"/>
+                <w:szCs w:val="19"/>
+              </w:rPr>
+              <w:t xml:space="preserve">Informal pre-submission walkthrough</w:t>
+            </w:r>
+          </w:p>
+        </w:tc>
+        <w:tc>
+          <w:tcPr>
+            <w:tcW w:type="dxa" w:w="2000"/>
+            <w:shd w:fill="D9E2F3" w:val="clear"/>
+            <w:tcMar>
+              <w:top w:type="dxa" w:w="80"/>
+              <w:left w:type="dxa" w:w="100"/>
+              <w:bottom w:type="dxa" w:w="80"/>
+              <w:right w:type="dxa" w:w="100"/>
+            </w:tcMar>
+            <w:vAlign w:val="center"/>
+          </w:tcPr>
+          <w:p>
+            <w:r>
+              <w:rPr>
+                <w:sz w:val="19"/>
+                <w:szCs w:val="19"/>
+              </w:rPr>
+              <w:t xml:space="preserve">Before major permit submissions</w:t>
+            </w:r>
+          </w:p>
+        </w:tc>
+        <w:tc>
+          <w:tcPr>
+            <w:tcW w:type="dxa" w:w="2200"/>
+            <w:shd w:fill="D9E2F3" w:val="clear"/>
+            <w:tcMar>
+              <w:top w:type="dxa" w:w="80"/>
+              <w:left w:type="dxa" w:w="100"/>
+              <w:bottom w:type="dxa" w:w="80"/>
+              <w:right w:type="dxa" w:w="100"/>
+            </w:tcMar>
+            <w:vAlign w:val="center"/>
+          </w:tcPr>
+          <w:p>
+            <w:r>
+              <w:rPr>
+                <w:sz w:val="19"/>
+                <w:szCs w:val="19"/>
+              </w:rPr>
+              <w:t xml:space="preserve">PM</w:t>
+            </w:r>
+          </w:p>
+        </w:tc>
+      </w:tr>
+      <w:tr>
+        <w:tc>
+          <w:tcPr>
+            <w:tcW w:type="dxa" w:w="3200"/>
+            <w:tcMar>
+              <w:top w:type="dxa" w:w="80"/>
+              <w:left w:type="dxa" w:w="100"/>
+              <w:bottom w:type="dxa" w:w="80"/>
+              <w:right w:type="dxa" w:w="100"/>
+            </w:tcMar>
+            <w:vAlign w:val="center"/>
+          </w:tcPr>
+          <w:p>
+            <w:r>
+              <w:rPr>
+                <w:sz w:val="19"/>
+                <w:szCs w:val="19"/>
+              </w:rPr>
+              <w:t xml:space="preserve">Subcontractor workmanship audit</w:t>
+            </w:r>
+          </w:p>
+        </w:tc>
+        <w:tc>
+          <w:tcPr>
+            <w:tcW w:type="dxa" w:w="3400"/>
+            <w:tcMar>
+              <w:top w:type="dxa" w:w="80"/>
+              <w:left w:type="dxa" w:w="100"/>
+              <w:bottom w:type="dxa" w:w="80"/>
+              <w:right w:type="dxa" w:w="100"/>
+            </w:tcMar>
+            <w:vAlign w:val="center"/>
+          </w:tcPr>
+          <w:p>
+            <w:r>
+              <w:rPr>
+                <w:sz w:val="19"/>
+                <w:szCs w:val="19"/>
+              </w:rPr>
+              <w:t xml:space="preserve">Site walk against approved submittals/shop drawings</w:t>
+            </w:r>
+          </w:p>
+        </w:tc>
+        <w:tc>
+          <w:tcPr>
+            <w:tcW w:type="dxa" w:w="2000"/>
+            <w:tcMar>
+              <w:top w:type="dxa" w:w="80"/>
+              <w:left w:type="dxa" w:w="100"/>
+              <w:bottom w:type="dxa" w:w="80"/>
+              <w:right w:type="dxa" w:w="100"/>
+            </w:tcMar>
+            <w:vAlign w:val="center"/>
+          </w:tcPr>
+          <w:p>
+            <w:r>
+              <w:rPr>
+                <w:sz w:val="19"/>
+                <w:szCs w:val="19"/>
+              </w:rPr>
+              <w:t xml:space="preserve">Weekly during active trade work</w:t>
+            </w:r>
+          </w:p>
+        </w:tc>
+        <w:tc>
+          <w:tcPr>
+            <w:tcW w:type="dxa" w:w="2200"/>
+            <w:tcMar>
+              <w:top w:type="dxa" w:w="80"/>
+              <w:left w:type="dxa" w:w="100"/>
+              <w:bottom w:type="dxa" w:w="80"/>
+              <w:right w:type="dxa" w:w="100"/>
+            </w:tcMar>
+            <w:vAlign w:val="center"/>
+          </w:tcPr>
+          <w:p>
+            <w:r>
+              <w:rPr>
+                <w:sz w:val="19"/>
+                <w:szCs w:val="19"/>
+              </w:rPr>
+              <w:t xml:space="preserve">GC</w:t>
+            </w:r>
+          </w:p>
+        </w:tc>
+      </w:tr>
+      <w:tr>
+        <w:tc>
+          <w:tcPr>
+            <w:tcW w:type="dxa" w:w="3200"/>
+            <w:shd w:fill="D9E2F3" w:val="clear"/>
+            <w:tcMar>
+              <w:top w:type="dxa" w:w="80"/>
+              <w:left w:type="dxa" w:w="100"/>
+              <w:bottom w:type="dxa" w:w="80"/>
+              <w:right w:type="dxa" w:w="100"/>
+            </w:tcMar>
+            <w:vAlign w:val="center"/>
+          </w:tcPr>
+          <w:p>
+            <w:r>
+              <w:rPr>
+                <w:sz w:val="19"/>
+                <w:szCs w:val="19"/>
+              </w:rPr>
+              <w:t xml:space="preserve">RFI / submittal log review</w:t>
+            </w:r>
+          </w:p>
+        </w:tc>
+        <w:tc>
+          <w:tcPr>
+            <w:tcW w:type="dxa" w:w="3400"/>
+            <w:shd w:fill="D9E2F3" w:val="clear"/>
+            <w:tcMar>
+              <w:top w:type="dxa" w:w="80"/>
+              <w:left w:type="dxa" w:w="100"/>
+              <w:bottom w:type="dxa" w:w="80"/>
+              <w:right w:type="dxa" w:w="100"/>
+            </w:tcMar>
+            <w:vAlign w:val="center"/>
+          </w:tcPr>
+          <w:p>
+            <w:r>
+              <w:rPr>
+                <w:sz w:val="19"/>
+                <w:szCs w:val="19"/>
+              </w:rPr>
+              <w:t xml:space="preserve">Standing log reviewed for open compliance questions</w:t>
+            </w:r>
+          </w:p>
+        </w:tc>
+        <w:tc>
+          <w:tcPr>
+            <w:tcW w:type="dxa" w:w="2000"/>
+            <w:shd w:fill="D9E2F3" w:val="clear"/>
+            <w:tcMar>
+              <w:top w:type="dxa" w:w="80"/>
+              <w:left w:type="dxa" w:w="100"/>
+              <w:bottom w:type="dxa" w:w="80"/>
+              <w:right w:type="dxa" w:w="100"/>
+            </w:tcMar>
+            <w:vAlign w:val="center"/>
+          </w:tcPr>
+          <w:p>
+            <w:r>
+              <w:rPr>
+                <w:sz w:val="19"/>
+                <w:szCs w:val="19"/>
+              </w:rPr>
+              <w:t xml:space="preserve">Weekly site meeting</w:t>
+            </w:r>
+          </w:p>
+        </w:tc>
+        <w:tc>
+          <w:tcPr>
+            <w:tcW w:type="dxa" w:w="2200"/>
+            <w:shd w:fill="D9E2F3" w:val="clear"/>
+            <w:tcMar>
+              <w:top w:type="dxa" w:w="80"/>
+              <w:left w:type="dxa" w:w="100"/>
+              <w:bottom w:type="dxa" w:w="80"/>
+              <w:right w:type="dxa" w:w="100"/>
+            </w:tcMar>
+            <w:vAlign w:val="center"/>
+          </w:tcPr>
+          <w:p>
+            <w:r>
+              <w:rPr>
+                <w:sz w:val="19"/>
+                <w:szCs w:val="19"/>
+              </w:rPr>
+              <w:t xml:space="preserve">PM</w:t>
+            </w:r>
+          </w:p>
+        </w:tc>
+      </w:tr>
+    </w:tbl>
+    <w:p>
+      <w:pPr>
+        <w:spacing w:after="120"/>
+      </w:pPr>
+    </w:p>
+    <w:p>
+      <w:pPr>
+        <w:pStyle w:val="Heading2"/>
+        <w:spacing w:after="100" w:before="220"/>
+      </w:pPr>
+      <w:r>
+        <w:rPr>
+          <w:b/>
+          <w:bCs/>
+          <w:color w:val="44546A"/>
+          <w:sz w:val="23"/>
+          <w:szCs w:val="23"/>
+        </w:rPr>
+        <w:t xml:space="preserve">3.3  Quality Control / Inspection &amp; Test Plan</w:t>
+      </w:r>
+    </w:p>
+    <w:p>
+      <w:pPr>
+        <w:spacing w:after="160"/>
+      </w:pPr>
+      <w:r>
+        <w:rPr>
+          <w:sz w:val="21"/>
+          <w:szCs w:val="21"/>
+        </w:rPr>
+        <w:t xml:space="preserve">Inspection and test checkpoints that gate progress from one phase to the next — a deliverable is not considered complete until it passes its checkpoint.</w:t>
+      </w:r>
+    </w:p>
+    <w:tbl>
+      <w:tblPr>
+        <w:tblW w:type="dxa" w:w="10800"/>
+        <w:tblBorders>
+          <w:top w:val="single" w:color="auto" w:sz="4"/>
+          <w:left w:val="single" w:color="auto" w:sz="4"/>
+          <w:bottom w:val="single" w:color="auto" w:sz="4"/>
+          <w:right w:val="single" w:color="auto" w:sz="4"/>
+          <w:insideH w:val="single" w:color="auto" w:sz="4"/>
+          <w:insideV w:val="single" w:color="auto" w:sz="4"/>
+        </w:tblBorders>
+      </w:tblPr>
+      <w:tblGrid>
+        <w:gridCol w:w="2800"/>
+        <w:gridCol w:w="3400"/>
+        <w:gridCol w:w="2600"/>
+        <w:gridCol w:w="2000"/>
+      </w:tblGrid>
+      <w:tr>
+        <w:trPr>
+          <w:tblHeader/>
+        </w:trPr>
+        <w:tc>
+          <w:tcPr>
+            <w:tcW w:type="dxa" w:w="2800"/>
+            <w:shd w:fill="1F3864" w:val="clear"/>
+            <w:tcMar>
+              <w:top w:type="dxa" w:w="80"/>
+              <w:left w:type="dxa" w:w="100"/>
+              <w:bottom w:type="dxa" w:w="80"/>
+              <w:right w:type="dxa" w:w="100"/>
+            </w:tcMar>
+            <w:vAlign w:val="center"/>
+          </w:tcPr>
+          <w:p>
+            <w:r>
+              <w:rPr>
+                <w:b/>
+                <w:bCs/>
+                <w:color w:val="FFFFFF"/>
+                <w:sz w:val="19"/>
+                <w:szCs w:val="19"/>
+              </w:rPr>
+              <w:t xml:space="preserve">Deliverable / Checkpoint</w:t>
+            </w:r>
+          </w:p>
+        </w:tc>
+        <w:tc>
+          <w:tcPr>
+            <w:tcW w:type="dxa" w:w="3400"/>
+            <w:shd w:fill="1F3864" w:val="clear"/>
+            <w:tcMar>
+              <w:top w:type="dxa" w:w="80"/>
+              <w:left w:type="dxa" w:w="100"/>
+              <w:bottom w:type="dxa" w:w="80"/>
+              <w:right w:type="dxa" w:w="100"/>
+            </w:tcMar>
+            <w:vAlign w:val="center"/>
+          </w:tcPr>
+          <w:p>
+            <w:r>
+              <w:rPr>
+                <w:b/>
+                <w:bCs/>
+                <w:color w:val="FFFFFF"/>
+                <w:sz w:val="19"/>
+                <w:szCs w:val="19"/>
+              </w:rPr>
+              <w:t xml:space="preserve">Acceptance Criteria</w:t>
+            </w:r>
+          </w:p>
+        </w:tc>
+        <w:tc>
+          <w:tcPr>
+            <w:tcW w:type="dxa" w:w="2600"/>
+            <w:shd w:fill="1F3864" w:val="clear"/>
+            <w:tcMar>
+              <w:top w:type="dxa" w:w="80"/>
+              <w:left w:type="dxa" w:w="100"/>
+              <w:bottom w:type="dxa" w:w="80"/>
+              <w:right w:type="dxa" w:w="100"/>
+            </w:tcMar>
+            <w:vAlign w:val="center"/>
+          </w:tcPr>
+          <w:p>
+            <w:r>
+              <w:rPr>
+                <w:b/>
+                <w:bCs/>
+                <w:color w:val="FFFFFF"/>
+                <w:sz w:val="19"/>
+                <w:szCs w:val="19"/>
+              </w:rPr>
+              <w:t xml:space="preserve">Inspection Method</w:t>
+            </w:r>
+          </w:p>
+        </w:tc>
+        <w:tc>
+          <w:tcPr>
+            <w:tcW w:type="dxa" w:w="2000"/>
+            <w:shd w:fill="1F3864" w:val="clear"/>
+            <w:tcMar>
+              <w:top w:type="dxa" w:w="80"/>
+              <w:left w:type="dxa" w:w="100"/>
+              <w:bottom w:type="dxa" w:w="80"/>
+              <w:right w:type="dxa" w:w="100"/>
+            </w:tcMar>
+            <w:vAlign w:val="center"/>
+          </w:tcPr>
+          <w:p>
+            <w:r>
+              <w:rPr>
+                <w:b/>
+                <w:bCs/>
+                <w:color w:val="FFFFFF"/>
+                <w:sz w:val="19"/>
+                <w:szCs w:val="19"/>
+              </w:rPr>
+              <w:t xml:space="preserve">Owner</w:t>
+            </w:r>
+          </w:p>
+        </w:tc>
+      </w:tr>
+      <w:tr>
+        <w:tc>
+          <w:tcPr>
+            <w:tcW w:type="dxa" w:w="2800"/>
+            <w:tcMar>
+              <w:top w:type="dxa" w:w="80"/>
+              <w:left w:type="dxa" w:w="100"/>
+              <w:bottom w:type="dxa" w:w="80"/>
+              <w:right w:type="dxa" w:w="100"/>
+            </w:tcMar>
+            <w:vAlign w:val="center"/>
+          </w:tcPr>
+          <w:p>
+            <w:r>
+              <w:rPr>
+                <w:sz w:val="19"/>
+                <w:szCs w:val="19"/>
+              </w:rPr>
+              <w:t xml:space="preserve">Foundation / sitework inspection</w:t>
+            </w:r>
+          </w:p>
+        </w:tc>
+        <w:tc>
+          <w:tcPr>
+            <w:tcW w:type="dxa" w:w="3400"/>
+            <w:tcMar>
+              <w:top w:type="dxa" w:w="80"/>
+              <w:left w:type="dxa" w:w="100"/>
+              <w:bottom w:type="dxa" w:w="80"/>
+              <w:right w:type="dxa" w:w="100"/>
+            </w:tcMar>
+            <w:vAlign w:val="center"/>
+          </w:tcPr>
+          <w:p>
+            <w:r>
+              <w:rPr>
+                <w:sz w:val="19"/>
+                <w:szCs w:val="19"/>
+              </w:rPr>
+              <w:t xml:space="preserve">Passes AHJ foundation inspection; geotechnical sign-off</w:t>
+            </w:r>
+          </w:p>
+        </w:tc>
+        <w:tc>
+          <w:tcPr>
+            <w:tcW w:type="dxa" w:w="2600"/>
+            <w:tcMar>
+              <w:top w:type="dxa" w:w="80"/>
+              <w:left w:type="dxa" w:w="100"/>
+              <w:bottom w:type="dxa" w:w="80"/>
+              <w:right w:type="dxa" w:w="100"/>
+            </w:tcMar>
+            <w:vAlign w:val="center"/>
+          </w:tcPr>
+          <w:p>
+            <w:r>
+              <w:rPr>
+                <w:sz w:val="19"/>
+                <w:szCs w:val="19"/>
+              </w:rPr>
+              <w:t xml:space="preserve">AHJ inspection</w:t>
+            </w:r>
+          </w:p>
+        </w:tc>
+        <w:tc>
+          <w:tcPr>
+            <w:tcW w:type="dxa" w:w="2000"/>
+            <w:tcMar>
+              <w:top w:type="dxa" w:w="80"/>
+              <w:left w:type="dxa" w:w="100"/>
+              <w:bottom w:type="dxa" w:w="80"/>
+              <w:right w:type="dxa" w:w="100"/>
+            </w:tcMar>
+            <w:vAlign w:val="center"/>
+          </w:tcPr>
+          <w:p>
+            <w:r>
+              <w:rPr>
+                <w:sz w:val="19"/>
+                <w:szCs w:val="19"/>
+              </w:rPr>
+              <w:t xml:space="preserve">General Contractor</w:t>
+            </w:r>
+          </w:p>
+        </w:tc>
+      </w:tr>
+      <w:tr>
+        <w:tc>
+          <w:tcPr>
+            <w:tcW w:type="dxa" w:w="2800"/>
+            <w:shd w:fill="D9E2F3" w:val="clear"/>
+            <w:tcMar>
+              <w:top w:type="dxa" w:w="80"/>
+              <w:left w:type="dxa" w:w="100"/>
+              <w:bottom w:type="dxa" w:w="80"/>
+              <w:right w:type="dxa" w:w="100"/>
+            </w:tcMar>
+            <w:vAlign w:val="center"/>
+          </w:tcPr>
+          <w:p>
+            <w:r>
+              <w:rPr>
+                <w:sz w:val="19"/>
+                <w:szCs w:val="19"/>
+              </w:rPr>
+              <w:t xml:space="preserve">MEP rough-in inspection (electrical, mechanical, fire suppression)</w:t>
+            </w:r>
+          </w:p>
+        </w:tc>
+        <w:tc>
+          <w:tcPr>
+            <w:tcW w:type="dxa" w:w="3400"/>
+            <w:shd w:fill="D9E2F3" w:val="clear"/>
+            <w:tcMar>
+              <w:top w:type="dxa" w:w="80"/>
+              <w:left w:type="dxa" w:w="100"/>
+              <w:bottom w:type="dxa" w:w="80"/>
+              <w:right w:type="dxa" w:w="100"/>
+            </w:tcMar>
+            <w:vAlign w:val="center"/>
+          </w:tcPr>
+          <w:p>
+            <w:r>
+              <w:rPr>
+                <w:sz w:val="19"/>
+                <w:szCs w:val="19"/>
+              </w:rPr>
+              <w:t xml:space="preserve">Passes AHJ rough-in inspection; matches approved design</w:t>
+            </w:r>
+          </w:p>
+        </w:tc>
+        <w:tc>
+          <w:tcPr>
+            <w:tcW w:type="dxa" w:w="2600"/>
+            <w:shd w:fill="D9E2F3" w:val="clear"/>
+            <w:tcMar>
+              <w:top w:type="dxa" w:w="80"/>
+              <w:left w:type="dxa" w:w="100"/>
+              <w:bottom w:type="dxa" w:w="80"/>
+              <w:right w:type="dxa" w:w="100"/>
+            </w:tcMar>
+            <w:vAlign w:val="center"/>
+          </w:tcPr>
+          <w:p>
+            <w:r>
+              <w:rPr>
+                <w:sz w:val="19"/>
+                <w:szCs w:val="19"/>
+              </w:rPr>
+              <w:t xml:space="preserve">AHJ inspection</w:t>
+            </w:r>
+          </w:p>
+        </w:tc>
+        <w:tc>
+          <w:tcPr>
+            <w:tcW w:type="dxa" w:w="2000"/>
+            <w:shd w:fill="D9E2F3" w:val="clear"/>
+            <w:tcMar>
+              <w:top w:type="dxa" w:w="80"/>
+              <w:left w:type="dxa" w:w="100"/>
+              <w:bottom w:type="dxa" w:w="80"/>
+              <w:right w:type="dxa" w:w="100"/>
+            </w:tcMar>
+            <w:vAlign w:val="center"/>
+          </w:tcPr>
+          <w:p>
+            <w:r>
+              <w:rPr>
+                <w:sz w:val="19"/>
+                <w:szCs w:val="19"/>
+              </w:rPr>
+              <w:t xml:space="preserve">GC / Subcontractors</w:t>
+            </w:r>
+          </w:p>
+        </w:tc>
+      </w:tr>
+      <w:tr>
+        <w:tc>
+          <w:tcPr>
+            <w:tcW w:type="dxa" w:w="2800"/>
+            <w:tcMar>
+              <w:top w:type="dxa" w:w="80"/>
+              <w:left w:type="dxa" w:w="100"/>
+              <w:bottom w:type="dxa" w:w="80"/>
+              <w:right w:type="dxa" w:w="100"/>
+            </w:tcMar>
+            <w:vAlign w:val="center"/>
+          </w:tcPr>
+          <w:p>
+            <w:r>
+              <w:rPr>
+                <w:sz w:val="19"/>
+                <w:szCs w:val="19"/>
+              </w:rPr>
+              <w:t xml:space="preserve">Level 1–2 Commissioning (equipment startup, functional test)</w:t>
+            </w:r>
+          </w:p>
+        </w:tc>
+        <w:tc>
+          <w:tcPr>
+            <w:tcW w:type="dxa" w:w="3400"/>
+            <w:tcMar>
+              <w:top w:type="dxa" w:w="80"/>
+              <w:left w:type="dxa" w:w="100"/>
+              <w:bottom w:type="dxa" w:w="80"/>
+              <w:right w:type="dxa" w:w="100"/>
+            </w:tcMar>
+            <w:vAlign w:val="center"/>
+          </w:tcPr>
+          <w:p>
+            <w:r>
+              <w:rPr>
+                <w:sz w:val="19"/>
+                <w:szCs w:val="19"/>
+              </w:rPr>
+              <w:t xml:space="preserve">Equipment operates to manufacturer spec under static and functional test</w:t>
+            </w:r>
+          </w:p>
+        </w:tc>
+        <w:tc>
+          <w:tcPr>
+            <w:tcW w:type="dxa" w:w="2600"/>
+            <w:tcMar>
+              <w:top w:type="dxa" w:w="80"/>
+              <w:left w:type="dxa" w:w="100"/>
+              <w:bottom w:type="dxa" w:w="80"/>
+              <w:right w:type="dxa" w:w="100"/>
+            </w:tcMar>
+            <w:vAlign w:val="center"/>
+          </w:tcPr>
+          <w:p>
+            <w:r>
+              <w:rPr>
+                <w:sz w:val="19"/>
+                <w:szCs w:val="19"/>
+              </w:rPr>
+              <w:t xml:space="preserve">Commissioning Agent witness test</w:t>
+            </w:r>
+          </w:p>
+        </w:tc>
+        <w:tc>
+          <w:tcPr>
+            <w:tcW w:type="dxa" w:w="2000"/>
+            <w:tcMar>
+              <w:top w:type="dxa" w:w="80"/>
+              <w:left w:type="dxa" w:w="100"/>
+              <w:bottom w:type="dxa" w:w="80"/>
+              <w:right w:type="dxa" w:w="100"/>
+            </w:tcMar>
+            <w:vAlign w:val="center"/>
+          </w:tcPr>
+          <w:p>
+            <w:r>
+              <w:rPr>
+                <w:sz w:val="19"/>
+                <w:szCs w:val="19"/>
+              </w:rPr>
+              <w:t xml:space="preserve">Commissioning Agent</w:t>
+            </w:r>
+          </w:p>
+        </w:tc>
+      </w:tr>
+      <w:tr>
+        <w:tc>
+          <w:tcPr>
+            <w:tcW w:type="dxa" w:w="2800"/>
+            <w:shd w:fill="D9E2F3" w:val="clear"/>
+            <w:tcMar>
+              <w:top w:type="dxa" w:w="80"/>
+              <w:left w:type="dxa" w:w="100"/>
+              <w:bottom w:type="dxa" w:w="80"/>
+              <w:right w:type="dxa" w:w="100"/>
+            </w:tcMar>
+            <w:vAlign w:val="center"/>
+          </w:tcPr>
+          <w:p>
+            <w:r>
+              <w:rPr>
+                <w:sz w:val="19"/>
+                <w:szCs w:val="19"/>
+              </w:rPr>
+              <w:t xml:space="preserve">Level 3–4 Commissioning (integrated systems, simulated load/failure)</w:t>
+            </w:r>
+          </w:p>
+        </w:tc>
+        <w:tc>
+          <w:tcPr>
+            <w:tcW w:type="dxa" w:w="3400"/>
+            <w:shd w:fill="D9E2F3" w:val="clear"/>
+            <w:tcMar>
+              <w:top w:type="dxa" w:w="80"/>
+              <w:left w:type="dxa" w:w="100"/>
+              <w:bottom w:type="dxa" w:w="80"/>
+              <w:right w:type="dxa" w:w="100"/>
+            </w:tcMar>
+            <w:vAlign w:val="center"/>
+          </w:tcPr>
+          <w:p>
+            <w:r>
+              <w:rPr>
+                <w:sz w:val="19"/>
+                <w:szCs w:val="19"/>
+              </w:rPr>
+              <w:t xml:space="preserve">Power/cooling failover performs to design under simulated utility failure and full IT load</w:t>
+            </w:r>
+          </w:p>
+        </w:tc>
+        <w:tc>
+          <w:tcPr>
+            <w:tcW w:type="dxa" w:w="2600"/>
+            <w:shd w:fill="D9E2F3" w:val="clear"/>
+            <w:tcMar>
+              <w:top w:type="dxa" w:w="80"/>
+              <w:left w:type="dxa" w:w="100"/>
+              <w:bottom w:type="dxa" w:w="80"/>
+              <w:right w:type="dxa" w:w="100"/>
+            </w:tcMar>
+            <w:vAlign w:val="center"/>
+          </w:tcPr>
+          <w:p>
+            <w:r>
+              <w:rPr>
+                <w:sz w:val="19"/>
+                <w:szCs w:val="19"/>
+              </w:rPr>
+              <w:t xml:space="preserve">Commissioning Agent witness test</w:t>
+            </w:r>
+          </w:p>
+        </w:tc>
+        <w:tc>
+          <w:tcPr>
+            <w:tcW w:type="dxa" w:w="2000"/>
+            <w:shd w:fill="D9E2F3" w:val="clear"/>
+            <w:tcMar>
+              <w:top w:type="dxa" w:w="80"/>
+              <w:left w:type="dxa" w:w="100"/>
+              <w:bottom w:type="dxa" w:w="80"/>
+              <w:right w:type="dxa" w:w="100"/>
+            </w:tcMar>
+            <w:vAlign w:val="center"/>
+          </w:tcPr>
+          <w:p>
+            <w:r>
+              <w:rPr>
+                <w:sz w:val="19"/>
+                <w:szCs w:val="19"/>
+              </w:rPr>
+              <w:t xml:space="preserve">Commissioning Agent</w:t>
+            </w:r>
+          </w:p>
+        </w:tc>
+      </w:tr>
+      <w:tr>
+        <w:tc>
+          <w:tcPr>
+            <w:tcW w:type="dxa" w:w="2800"/>
+            <w:tcMar>
+              <w:top w:type="dxa" w:w="80"/>
+              <w:left w:type="dxa" w:w="100"/>
+              <w:bottom w:type="dxa" w:w="80"/>
+              <w:right w:type="dxa" w:w="100"/>
+            </w:tcMar>
+            <w:vAlign w:val="center"/>
+          </w:tcPr>
+          <w:p>
+            <w:r>
+              <w:rPr>
+                <w:sz w:val="19"/>
+                <w:szCs w:val="19"/>
+              </w:rPr>
+              <w:t xml:space="preserve">Final punch-list walkthrough</w:t>
+            </w:r>
+          </w:p>
+        </w:tc>
+        <w:tc>
+          <w:tcPr>
+            <w:tcW w:type="dxa" w:w="3400"/>
+            <w:tcMar>
+              <w:top w:type="dxa" w:w="80"/>
+              <w:left w:type="dxa" w:w="100"/>
+              <w:bottom w:type="dxa" w:w="80"/>
+              <w:right w:type="dxa" w:w="100"/>
+            </w:tcMar>
+            <w:vAlign w:val="center"/>
+          </w:tcPr>
+          <w:p>
+            <w:r>
+              <w:rPr>
+                <w:sz w:val="19"/>
+                <w:szCs w:val="19"/>
+              </w:rPr>
+              <w:t xml:space="preserve">No open life-safety items; all other items logged with an owner and due date</w:t>
+            </w:r>
+          </w:p>
+        </w:tc>
+        <w:tc>
+          <w:tcPr>
+            <w:tcW w:type="dxa" w:w="2600"/>
+            <w:tcMar>
+              <w:top w:type="dxa" w:w="80"/>
+              <w:left w:type="dxa" w:w="100"/>
+              <w:bottom w:type="dxa" w:w="80"/>
+              <w:right w:type="dxa" w:w="100"/>
+            </w:tcMar>
+            <w:vAlign w:val="center"/>
+          </w:tcPr>
+          <w:p>
+            <w:r>
+              <w:rPr>
+                <w:sz w:val="19"/>
+                <w:szCs w:val="19"/>
+              </w:rPr>
+              <w:t xml:space="preserve">Joint GC / IT Ops walkthrough</w:t>
+            </w:r>
+          </w:p>
+        </w:tc>
+        <w:tc>
+          <w:tcPr>
+            <w:tcW w:type="dxa" w:w="2000"/>
+            <w:tcMar>
+              <w:top w:type="dxa" w:w="80"/>
+              <w:left w:type="dxa" w:w="100"/>
+              <w:bottom w:type="dxa" w:w="80"/>
+              <w:right w:type="dxa" w:w="100"/>
+            </w:tcMar>
+            <w:vAlign w:val="center"/>
+          </w:tcPr>
+          <w:p>
+            <w:r>
+              <w:rPr>
+                <w:sz w:val="19"/>
+                <w:szCs w:val="19"/>
+              </w:rPr>
+              <w:t xml:space="preserve">PM</w:t>
+            </w:r>
+          </w:p>
+        </w:tc>
+      </w:tr>
+    </w:tbl>
+    <w:p>
+      <w:pPr>
+        <w:pStyle w:val="Heading1"/>
+        <w:pBdr>
+          <w:bottom w:val="single" w:color="1F3864" w:sz="6" w:space="4"/>
+        </w:pBdr>
+        <w:spacing w:after="160" w:before="320"/>
+      </w:pPr>
+      <w:r>
+        <w:rPr>
+          <w:b/>
+          <w:bCs/>
+          <w:color w:val="1F3864"/>
+          <w:sz w:val="27"/>
+          <w:szCs w:val="27"/>
+        </w:rPr>
+        <w:t xml:space="preserve">4. Commissioning &amp; Facility Handover Plan</w:t>
       </w:r>
     </w:p>
     <w:p>

</xml_diff>